<commit_message>
FormaRézo : livraison, 1 station(s)
Copie servie fabriquée par formarezo/outils/livrer.py (atelier C:/git/formarezo) ; le dossier prof/ ne part pas en clair.

Co-Authored-By: Claude Opus 5.5 <noreply@anthropic.com>
</commit_message>
<xml_diff>
--- a/formarezo/stations/1-1-carte-r134a/documents/TD04-ma-grille-aidee.docx
+++ b/formarezo/stations/1-1-carte-r134a/documents/TD04-ma-grille-aidee.docx
@@ -95,6 +95,7 @@
       </w:r>
     </w:p>
     <w:sectPr>
+      <w:footerReference w:type="default" r:id="rId10"/>
       <w:pgSz w:w="11906" w:h="16838" w:orient="portrait"/>
       <w:pgMar w:top="1000" w:right="1000" w:bottom="1000" w:left="1000" w:header="708" w:footer="708" w:gutter="0"/>
       <w:pgNumType/>
@@ -143,6 +144,24 @@
     </w:p>
   </w:endnote>
 </w:endnotes>
+</file>
+
+<file path=word/footer1.xml><?xml version="1.0" encoding="utf-8"?>
+<w:ftr xmlns:m="http://schemas.openxmlformats.org/officeDocument/2006/math" xmlns:mc="http://schemas.openxmlformats.org/markup-compatibility/2006" xmlns:mo="http://schemas.microsoft.com/office/mac/office/2008/main" xmlns:mv="urn:schemas-microsoft-com:mac:vml" xmlns:o="urn:schemas-microsoft-com:office:office" xmlns:r="http://schemas.openxmlformats.org/officeDocument/2006/relationships" xmlns:v="urn:schemas-microsoft-com:vml" xmlns:w10="urn:schemas-microsoft-com:office:word" xmlns:w14="http://schemas.microsoft.com/office/word/2010/wordml" xmlns:w="http://schemas.openxmlformats.org/wordprocessingml/2006/main" xmlns:wne="http://schemas.microsoft.com/office/word/2006/wordml" xmlns:wp14="http://schemas.microsoft.com/office/word/2010/wordprocessingDrawing" xmlns:wp="http://schemas.openxmlformats.org/drawingml/2006/wordprocessingDrawing" xmlns:wpc="http://schemas.microsoft.com/office/word/2010/wordprocessingCanvas" xmlns:wpg="http://schemas.microsoft.com/office/word/2010/wordprocessingGroup" xmlns:wpi="http://schemas.microsoft.com/office/word/2010/wordprocessingInk" xmlns:wps="http://schemas.microsoft.com/office/word/2010/wordprocessingShape" mc:Ignorable="w14 wp14">
+  <w:p>
+    <w:pPr>
+      <w:pStyle w:val="Footer"/>
+      <w:jc w:val="center"/>
+    </w:pPr>
+    <w:r>
+      <w:rPr>
+        <w:color w:val="5D6B7C"/>
+        <w:sz w:val="18"/>
+      </w:rPr>
+      <w:t>© 2026 inerWeb — F. Henninot · CC BY-NC-ND 4.0 : citer inerWeb, pas d’usage commercial, pas de modification · Illustrations : tous droits réservés</w:t>
+    </w:r>
+  </w:p>
+</w:ftr>
 </file>
 
 <file path=word/footnotes.xml><?xml version="1.0" encoding="utf-8"?>

</xml_diff>